<commit_message>
Weekly plans: replace 5 docx with updated versions (Suggested Outcome & Assessment for the Week), rebuild index + bake
</commit_message>
<xml_diff>
--- a/weekly-plans/PE-Weekly-Plan-Oct-5-9-2026-Football-Week-6.docx
+++ b/weekly-plans/PE-Weekly-Plan-Oct-5-9-2026-Football-Week-6.docx
@@ -3169,6 +3169,1801 @@
         <w:pStyle w:val="Heading2"/>
       </w:pPr>
       <w:r>
+        <w:t>Suggested Outcome &amp; Assessment for the Week</w:t>
+      </w:r>
+    </w:p>
+    <w:p>
+      <w:r>
+        <w:rPr>
+          <w:rFonts w:ascii="Calibri" w:hAnsi="Calibri"/>
+          <w:b w:val="0"/>
+          <w:sz w:val="22"/>
+        </w:rPr>
+        <w:t>Built only from this week’s lessons (Mon Oct 5 – Fri Oct 9): pitch/hand-off, defend the passing lane, small-sided flag, jail-catch football, and Friday apply/choice. Suggestion only — does not replace report-card outcomes.</w:t>
+      </w:r>
+    </w:p>
+    <w:p>
+      <w:r>
+        <w:rPr>
+          <w:rFonts w:ascii="Calibri" w:hAnsi="Calibri"/>
+          <w:b/>
+          <w:sz w:val="22"/>
+        </w:rPr>
+        <w:t>Suggested weekly learning outcome</w:t>
+      </w:r>
+    </w:p>
+    <w:p>
+      <w:r>
+        <w:rPr>
+          <w:rFonts w:ascii="Calibri" w:hAnsi="Calibri"/>
+          <w:b w:val="0"/>
+          <w:sz w:val="22"/>
+        </w:rPr>
+        <w:t>I can move safely with a football and my teammates: give and take a soft hand-off, defend the passing lane without contact, play fair small-sided flag (hike, pass, score), and make safe below-the-waist jail-catch throws that bring a teammate back.</w:t>
+      </w:r>
+    </w:p>
+    <w:p>
+      <w:r>
+        <w:rPr>
+          <w:rFonts w:ascii="Calibri" w:hAnsi="Calibri"/>
+          <w:b w:val="0"/>
+          <w:sz w:val="22"/>
+        </w:rPr>
+        <w:t>Aligned to the PEW (Alberta) organizing ideas already used in this plan: Movement Skill Development (hand-off, catching, throwing), Movement Tactics (defending the lane, small-sided flag), Safety (soft tag/soft flag, no contact, dodgeballs below the waist), and Healthy Relationships (fair play, everyone plays, bring a teammate back). Confirm exact LearnAlberta outcome wording before report cards.</w:t>
+      </w:r>
+    </w:p>
+    <w:p>
+      <w:r>
+        <w:rPr>
+          <w:rFonts w:ascii="Calibri" w:hAnsi="Calibri"/>
+          <w:b/>
+          <w:sz w:val="22"/>
+        </w:rPr>
+        <w:t>Rubric — 4 criteria from this week’s lessons</w:t>
+      </w:r>
+    </w:p>
+    <w:tbl>
+      <w:tblPr>
+        <w:tblStyle w:val="TableGrid"/>
+        <w:tblW w:type="auto" w:w="0"/>
+        <w:tblLayout w:type="fixed"/>
+        <w:tblLook w:firstColumn="1" w:firstRow="1" w:lastColumn="0" w:lastRow="0" w:noHBand="0" w:noVBand="1" w:val="04A0"/>
+        <w:tblLayout w:type="fixed"/>
+      </w:tblPr>
+      <w:tblGrid>
+        <w:gridCol w:w="1400"/>
+        <w:gridCol w:w="1900"/>
+        <w:gridCol w:w="1900"/>
+        <w:gridCol w:w="1900"/>
+        <w:gridCol w:w="1900"/>
+      </w:tblGrid>
+      <w:tr>
+        <w:trPr>
+          <w:tblHeader/>
+          <w:cantSplit/>
+        </w:trPr>
+        <w:tc>
+          <w:tcPr>
+            <w:tcW w:type="dxa" w:w="1400"/>
+            <w:shd w:val="clear" w:color="auto" w:fill="D9D9D9"/>
+          </w:tcPr>
+          <w:p>
+            <w:pPr>
+              <w:spacing w:after="40" w:before="40"/>
+            </w:pPr>
+            <w:r>
+              <w:rPr>
+                <w:rFonts w:ascii="Calibri" w:hAnsi="Calibri"/>
+                <w:b/>
+                <w:sz w:val="18"/>
+              </w:rPr>
+              <w:t>Criterion (lesson)</w:t>
+            </w:r>
+          </w:p>
+        </w:tc>
+        <w:tc>
+          <w:tcPr>
+            <w:tcW w:type="dxa" w:w="1900"/>
+            <w:shd w:val="clear" w:color="auto" w:fill="D9D9D9"/>
+          </w:tcPr>
+          <w:p>
+            <w:pPr>
+              <w:spacing w:after="40" w:before="40"/>
+            </w:pPr>
+            <w:r>
+              <w:rPr>
+                <w:rFonts w:ascii="Calibri" w:hAnsi="Calibri"/>
+                <w:b/>
+                <w:sz w:val="18"/>
+              </w:rPr>
+              <w:t>Beginning</w:t>
+            </w:r>
+          </w:p>
+        </w:tc>
+        <w:tc>
+          <w:tcPr>
+            <w:tcW w:type="dxa" w:w="1900"/>
+            <w:shd w:val="clear" w:color="auto" w:fill="D9D9D9"/>
+          </w:tcPr>
+          <w:p>
+            <w:pPr>
+              <w:spacing w:after="40" w:before="40"/>
+            </w:pPr>
+            <w:r>
+              <w:rPr>
+                <w:rFonts w:ascii="Calibri" w:hAnsi="Calibri"/>
+                <w:b/>
+                <w:sz w:val="18"/>
+              </w:rPr>
+              <w:t>Developing</w:t>
+            </w:r>
+          </w:p>
+        </w:tc>
+        <w:tc>
+          <w:tcPr>
+            <w:tcW w:type="dxa" w:w="1900"/>
+            <w:shd w:val="clear" w:color="auto" w:fill="D9D9D9"/>
+          </w:tcPr>
+          <w:p>
+            <w:pPr>
+              <w:spacing w:after="40" w:before="40"/>
+            </w:pPr>
+            <w:r>
+              <w:rPr>
+                <w:rFonts w:ascii="Calibri" w:hAnsi="Calibri"/>
+                <w:b/>
+                <w:sz w:val="18"/>
+              </w:rPr>
+              <w:t>Proficient</w:t>
+            </w:r>
+          </w:p>
+        </w:tc>
+        <w:tc>
+          <w:tcPr>
+            <w:tcW w:type="dxa" w:w="1900"/>
+            <w:shd w:val="clear" w:color="auto" w:fill="D9D9D9"/>
+          </w:tcPr>
+          <w:p>
+            <w:pPr>
+              <w:spacing w:after="40" w:before="40"/>
+            </w:pPr>
+            <w:r>
+              <w:rPr>
+                <w:rFonts w:ascii="Calibri" w:hAnsi="Calibri"/>
+                <w:b/>
+                <w:sz w:val="18"/>
+              </w:rPr>
+              <w:t>Extending</w:t>
+            </w:r>
+          </w:p>
+        </w:tc>
+      </w:tr>
+      <w:tr>
+        <w:trPr>
+          <w:cantSplit/>
+        </w:trPr>
+        <w:tc>
+          <w:tcPr>
+            <w:tcW w:type="dxa" w:w="1400"/>
+          </w:tcPr>
+          <w:p>
+            <w:pPr>
+              <w:spacing w:after="40" w:before="40"/>
+            </w:pPr>
+            <w:r>
+              <w:rPr>
+                <w:rFonts w:ascii="Calibri" w:hAnsi="Calibri"/>
+                <w:b/>
+                <w:sz w:val="18"/>
+              </w:rPr>
+              <w:t>1. Pitch &amp; hand-off</w:t>
+              <w:br/>
+              <w:t>(Mon Oct 5)</w:t>
+            </w:r>
+          </w:p>
+        </w:tc>
+        <w:tc>
+          <w:tcPr>
+            <w:tcW w:type="dxa" w:w="1900"/>
+          </w:tcPr>
+          <w:p>
+            <w:pPr>
+              <w:spacing w:after="40" w:before="40"/>
+            </w:pPr>
+            <w:r>
+              <w:rPr>
+                <w:rFonts w:ascii="Calibri" w:hAnsi="Calibri"/>
+                <w:b w:val="0"/>
+                <w:sz w:val="18"/>
+              </w:rPr>
+              <w:t>Needs reminders to give rather than throw at the runner; ball is dropped or the runner leaves before the give.</w:t>
+            </w:r>
+          </w:p>
+        </w:tc>
+        <w:tc>
+          <w:tcPr>
+            <w:tcW w:type="dxa" w:w="1900"/>
+          </w:tcPr>
+          <w:p>
+            <w:pPr>
+              <w:spacing w:after="40" w:before="40"/>
+            </w:pPr>
+            <w:r>
+              <w:rPr>
+                <w:rFonts w:ascii="Calibri" w:hAnsi="Calibri"/>
+                <w:b w:val="0"/>
+                <w:sz w:val="18"/>
+              </w:rPr>
+              <w:t>Gives the ball softly into the pocket most of the time; timing of the “go” is sometimes off.</w:t>
+            </w:r>
+          </w:p>
+        </w:tc>
+        <w:tc>
+          <w:tcPr>
+            <w:tcW w:type="dxa" w:w="1900"/>
+          </w:tcPr>
+          <w:p>
+            <w:pPr>
+              <w:spacing w:after="40" w:before="40"/>
+            </w:pPr>
+            <w:r>
+              <w:rPr>
+                <w:rFonts w:ascii="Calibri" w:hAnsi="Calibri"/>
+                <w:b w:val="0"/>
+                <w:sz w:val="18"/>
+              </w:rPr>
+              <w:t>Soft give into the pocket, then the runner goes; gives, doesn’t throw at the runner.</w:t>
+            </w:r>
+          </w:p>
+        </w:tc>
+        <w:tc>
+          <w:tcPr>
+            <w:tcW w:type="dxa" w:w="1900"/>
+          </w:tcPr>
+          <w:p>
+            <w:pPr>
+              <w:spacing w:after="40" w:before="40"/>
+            </w:pPr>
+            <w:r>
+              <w:rPr>
+                <w:rFonts w:ascii="Calibri" w:hAnsi="Calibri"/>
+                <w:b w:val="0"/>
+                <w:sz w:val="18"/>
+              </w:rPr>
+              <w:t>Proficient and smooth in game play (Dodge Lane / hand-off race); helps a partner get the give right.</w:t>
+            </w:r>
+          </w:p>
+        </w:tc>
+      </w:tr>
+      <w:tr>
+        <w:trPr>
+          <w:cantSplit/>
+        </w:trPr>
+        <w:tc>
+          <w:tcPr>
+            <w:tcW w:type="dxa" w:w="1400"/>
+          </w:tcPr>
+          <w:p>
+            <w:pPr>
+              <w:spacing w:after="40" w:before="40"/>
+            </w:pPr>
+            <w:r>
+              <w:rPr>
+                <w:rFonts w:ascii="Calibri" w:hAnsi="Calibri"/>
+                <w:b/>
+                <w:sz w:val="18"/>
+              </w:rPr>
+              <w:t>2. Defending the lane</w:t>
+              <w:br/>
+              <w:t>(Tue Oct 6)</w:t>
+            </w:r>
+          </w:p>
+        </w:tc>
+        <w:tc>
+          <w:tcPr>
+            <w:tcW w:type="dxa" w:w="1900"/>
+          </w:tcPr>
+          <w:p>
+            <w:pPr>
+              <w:spacing w:after="40" w:before="40"/>
+            </w:pPr>
+            <w:r>
+              <w:rPr>
+                <w:rFonts w:ascii="Calibri" w:hAnsi="Calibri"/>
+                <w:b w:val="0"/>
+                <w:sz w:val="18"/>
+              </w:rPr>
+              <w:t>Chases the person or reaches in; needs reminders to stay between receiver and ball; contact happens.</w:t>
+            </w:r>
+          </w:p>
+        </w:tc>
+        <w:tc>
+          <w:tcPr>
+            <w:tcW w:type="dxa" w:w="1900"/>
+          </w:tcPr>
+          <w:p>
+            <w:pPr>
+              <w:spacing w:after="40" w:before="40"/>
+            </w:pPr>
+            <w:r>
+              <w:rPr>
+                <w:rFonts w:ascii="Calibri" w:hAnsi="Calibri"/>
+                <w:b w:val="0"/>
+                <w:sz w:val="18"/>
+              </w:rPr>
+              <w:t>Stays between receiver and ball some of the time; head up with reminders; mostly no contact.</w:t>
+            </w:r>
+          </w:p>
+        </w:tc>
+        <w:tc>
+          <w:tcPr>
+            <w:tcW w:type="dxa" w:w="1900"/>
+          </w:tcPr>
+          <w:p>
+            <w:pPr>
+              <w:spacing w:after="40" w:before="40"/>
+            </w:pPr>
+            <w:r>
+              <w:rPr>
+                <w:rFonts w:ascii="Calibri" w:hAnsi="Calibri"/>
+                <w:b w:val="0"/>
+                <w:sz w:val="18"/>
+              </w:rPr>
+              <w:t>Stays between receiver and ball, head up; contests the ball, not the person — intercepts without contact.</w:t>
+            </w:r>
+          </w:p>
+        </w:tc>
+        <w:tc>
+          <w:tcPr>
+            <w:tcW w:type="dxa" w:w="1900"/>
+          </w:tcPr>
+          <w:p>
+            <w:pPr>
+              <w:spacing w:after="40" w:before="40"/>
+            </w:pPr>
+            <w:r>
+              <w:rPr>
+                <w:rFonts w:ascii="Calibri" w:hAnsi="Calibri"/>
+                <w:b w:val="0"/>
+                <w:sz w:val="18"/>
+              </w:rPr>
+              <w:t>Proficient in game play (Protect the King / Perfect Pass); can show or tell a classmate what a clean contest looks like.</w:t>
+            </w:r>
+          </w:p>
+        </w:tc>
+      </w:tr>
+      <w:tr>
+        <w:trPr>
+          <w:cantSplit/>
+        </w:trPr>
+        <w:tc>
+          <w:tcPr>
+            <w:tcW w:type="dxa" w:w="1400"/>
+          </w:tcPr>
+          <w:p>
+            <w:pPr>
+              <w:spacing w:after="40" w:before="40"/>
+            </w:pPr>
+            <w:r>
+              <w:rPr>
+                <w:rFonts w:ascii="Calibri" w:hAnsi="Calibri"/>
+                <w:b/>
+                <w:sz w:val="18"/>
+              </w:rPr>
+              <w:t>3. Small-sided flag play</w:t>
+              <w:br/>
+              <w:t>(Wed Oct 7, early dismissal)</w:t>
+            </w:r>
+          </w:p>
+        </w:tc>
+        <w:tc>
+          <w:tcPr>
+            <w:tcW w:type="dxa" w:w="1900"/>
+          </w:tcPr>
+          <w:p>
+            <w:pPr>
+              <w:spacing w:after="40" w:before="40"/>
+            </w:pPr>
+            <w:r>
+              <w:rPr>
+                <w:rFonts w:ascii="Calibri" w:hAnsi="Calibri"/>
+                <w:b w:val="0"/>
+                <w:sz w:val="18"/>
+              </w:rPr>
+              <w:t>Needs help with roles or order (hike → pass → score); touch or flag pull is not yet soft.</w:t>
+            </w:r>
+          </w:p>
+        </w:tc>
+        <w:tc>
+          <w:tcPr>
+            <w:tcW w:type="dxa" w:w="1900"/>
+          </w:tcPr>
+          <w:p>
+            <w:pPr>
+              <w:spacing w:after="40" w:before="40"/>
+            </w:pPr>
+            <w:r>
+              <w:rPr>
+                <w:rFonts w:ascii="Calibri" w:hAnsi="Calibri"/>
+                <w:b w:val="0"/>
+                <w:sz w:val="18"/>
+              </w:rPr>
+              <w:t>Follows hike → pass → score with reminders; sometimes forgets the five-second throw or the soft touch.</w:t>
+            </w:r>
+          </w:p>
+        </w:tc>
+        <w:tc>
+          <w:tcPr>
+            <w:tcW w:type="dxa" w:w="1900"/>
+          </w:tcPr>
+          <w:p>
+            <w:pPr>
+              <w:spacing w:after="40" w:before="40"/>
+            </w:pPr>
+            <w:r>
+              <w:rPr>
+                <w:rFonts w:ascii="Calibri" w:hAnsi="Calibri"/>
+                <w:b w:val="0"/>
+                <w:sz w:val="18"/>
+              </w:rPr>
+              <w:t>Plays hike → pass → score; soft two-hand touch / soft flag only; throws within five seconds; resets after a score so everyone plays.</w:t>
+            </w:r>
+          </w:p>
+        </w:tc>
+        <w:tc>
+          <w:tcPr>
+            <w:tcW w:type="dxa" w:w="1900"/>
+          </w:tcPr>
+          <w:p>
+            <w:pPr>
+              <w:spacing w:after="40" w:before="40"/>
+            </w:pPr>
+            <w:r>
+              <w:rPr>
+                <w:rFonts w:ascii="Calibri" w:hAnsi="Calibri"/>
+                <w:b w:val="0"/>
+                <w:sz w:val="18"/>
+              </w:rPr>
+              <w:t>Proficient and helps the reset so everyone plays; Gr 5–6 can also act as student QB/ref.</w:t>
+            </w:r>
+          </w:p>
+        </w:tc>
+      </w:tr>
+      <w:tr>
+        <w:trPr>
+          <w:cantSplit/>
+        </w:trPr>
+        <w:tc>
+          <w:tcPr>
+            <w:tcW w:type="dxa" w:w="1400"/>
+          </w:tcPr>
+          <w:p>
+            <w:pPr>
+              <w:spacing w:after="40" w:before="40"/>
+            </w:pPr>
+            <w:r>
+              <w:rPr>
+                <w:rFonts w:ascii="Calibri" w:hAnsi="Calibri"/>
+                <w:b/>
+                <w:sz w:val="18"/>
+              </w:rPr>
+              <w:t>4. Safe jail-catch &amp; teamwork</w:t>
+              <w:br/>
+              <w:t>(Thu Oct 8; apply Fri Oct 9)</w:t>
+            </w:r>
+          </w:p>
+        </w:tc>
+        <w:tc>
+          <w:tcPr>
+            <w:tcW w:type="dxa" w:w="1900"/>
+          </w:tcPr>
+          <w:p>
+            <w:pPr>
+              <w:spacing w:after="40" w:before="40"/>
+            </w:pPr>
+            <w:r>
+              <w:rPr>
+                <w:rFonts w:ascii="Calibri" w:hAnsi="Calibri"/>
+                <w:b w:val="0"/>
+                <w:sz w:val="18"/>
+              </w:rPr>
+              <w:t>Needs reminders about DODGEBALLS only, below the waist; may forget stretch 10, then back.</w:t>
+            </w:r>
+          </w:p>
+        </w:tc>
+        <w:tc>
+          <w:tcPr>
+            <w:tcW w:type="dxa" w:w="1900"/>
+          </w:tcPr>
+          <w:p>
+            <w:pPr>
+              <w:spacing w:after="40" w:before="40"/>
+            </w:pPr>
+            <w:r>
+              <w:rPr>
+                <w:rFonts w:ascii="Calibri" w:hAnsi="Calibri"/>
+                <w:b w:val="0"/>
+                <w:sz w:val="18"/>
+              </w:rPr>
+              <w:t>Throws below the waist most of the time; soft tag / stretch 10 and back with a reminder; helps free a teammate with prompting.</w:t>
+            </w:r>
+          </w:p>
+        </w:tc>
+        <w:tc>
+          <w:tcPr>
+            <w:tcW w:type="dxa" w:w="1900"/>
+          </w:tcPr>
+          <w:p>
+            <w:pPr>
+              <w:spacing w:after="40" w:before="40"/>
+            </w:pPr>
+            <w:r>
+              <w:rPr>
+                <w:rFonts w:ascii="Calibri" w:hAnsi="Calibri"/>
+                <w:b w:val="0"/>
+                <w:sz w:val="18"/>
+              </w:rPr>
+              <w:t>DODGEBALLS only, below the waist; frees a teammate with a toss, walks the sideline home, stretch 10 if hit then back in — fair, soft tag, hands to yourself.</w:t>
+            </w:r>
+          </w:p>
+        </w:tc>
+        <w:tc>
+          <w:tcPr>
+            <w:tcW w:type="dxa" w:w="1900"/>
+          </w:tcPr>
+          <w:p>
+            <w:pPr>
+              <w:spacing w:after="40" w:before="40"/>
+            </w:pPr>
+            <w:r>
+              <w:rPr>
+                <w:rFonts w:ascii="Calibri" w:hAnsi="Calibri"/>
+                <w:b w:val="0"/>
+                <w:sz w:val="18"/>
+              </w:rPr>
+              <w:t>Proficient and encourages teammates (names a soft catch, kind tag, or teammate cue); Gr 5–6 can also ref.</w:t>
+            </w:r>
+          </w:p>
+        </w:tc>
+      </w:tr>
+    </w:tbl>
+    <w:p/>
+    <w:p>
+      <w:r>
+        <w:rPr>
+          <w:rFonts w:ascii="Calibri" w:hAnsi="Calibri"/>
+          <w:b/>
+          <w:sz w:val="22"/>
+        </w:rPr>
+        <w:t>Proficient look-fors by grade band (from the daily lessons)</w:t>
+      </w:r>
+    </w:p>
+    <w:tbl>
+      <w:tblPr>
+        <w:tblStyle w:val="TableGrid"/>
+        <w:tblW w:type="auto" w:w="0"/>
+        <w:tblLayout w:type="fixed"/>
+        <w:tblLook w:firstColumn="1" w:firstRow="1" w:lastColumn="0" w:lastRow="0" w:noHBand="0" w:noVBand="1" w:val="04A0"/>
+        <w:tblLayout w:type="fixed"/>
+      </w:tblPr>
+      <w:tblGrid>
+        <w:gridCol w:w="1400"/>
+        <w:gridCol w:w="2533"/>
+        <w:gridCol w:w="2533"/>
+        <w:gridCol w:w="2534"/>
+      </w:tblGrid>
+      <w:tr>
+        <w:trPr>
+          <w:tblHeader/>
+          <w:cantSplit/>
+        </w:trPr>
+        <w:tc>
+          <w:tcPr>
+            <w:tcW w:type="dxa" w:w="1400"/>
+            <w:shd w:val="clear" w:color="auto" w:fill="D9D9D9"/>
+          </w:tcPr>
+          <w:p>
+            <w:pPr>
+              <w:spacing w:after="40" w:before="40"/>
+            </w:pPr>
+            <w:r>
+              <w:rPr>
+                <w:rFonts w:ascii="Calibri" w:hAnsi="Calibri"/>
+                <w:b/>
+                <w:sz w:val="18"/>
+              </w:rPr>
+              <w:t>Criterion</w:t>
+            </w:r>
+          </w:p>
+        </w:tc>
+        <w:tc>
+          <w:tcPr>
+            <w:tcW w:type="dxa" w:w="2533"/>
+            <w:shd w:val="clear" w:color="auto" w:fill="D9D9D9"/>
+          </w:tcPr>
+          <w:p>
+            <w:pPr>
+              <w:spacing w:after="40" w:before="40"/>
+            </w:pPr>
+            <w:r>
+              <w:rPr>
+                <w:rFonts w:ascii="Calibri" w:hAnsi="Calibri"/>
+                <w:b/>
+                <w:sz w:val="18"/>
+              </w:rPr>
+              <w:t>Grades 1–2</w:t>
+            </w:r>
+          </w:p>
+        </w:tc>
+        <w:tc>
+          <w:tcPr>
+            <w:tcW w:type="dxa" w:w="2533"/>
+            <w:shd w:val="clear" w:color="auto" w:fill="D9D9D9"/>
+          </w:tcPr>
+          <w:p>
+            <w:pPr>
+              <w:spacing w:after="40" w:before="40"/>
+            </w:pPr>
+            <w:r>
+              <w:rPr>
+                <w:rFonts w:ascii="Calibri" w:hAnsi="Calibri"/>
+                <w:b/>
+                <w:sz w:val="18"/>
+              </w:rPr>
+              <w:t>Grades 3–4</w:t>
+            </w:r>
+          </w:p>
+        </w:tc>
+        <w:tc>
+          <w:tcPr>
+            <w:tcW w:type="dxa" w:w="2534"/>
+            <w:shd w:val="clear" w:color="auto" w:fill="D9D9D9"/>
+          </w:tcPr>
+          <w:p>
+            <w:pPr>
+              <w:spacing w:after="40" w:before="40"/>
+            </w:pPr>
+            <w:r>
+              <w:rPr>
+                <w:rFonts w:ascii="Calibri" w:hAnsi="Calibri"/>
+                <w:b/>
+                <w:sz w:val="18"/>
+              </w:rPr>
+              <w:t>Grades 5–6</w:t>
+            </w:r>
+          </w:p>
+        </w:tc>
+      </w:tr>
+      <w:tr>
+        <w:trPr>
+          <w:cantSplit/>
+        </w:trPr>
+        <w:tc>
+          <w:tcPr>
+            <w:tcW w:type="dxa" w:w="1400"/>
+          </w:tcPr>
+          <w:p>
+            <w:pPr>
+              <w:spacing w:after="40" w:before="40"/>
+            </w:pPr>
+            <w:r>
+              <w:rPr>
+                <w:rFonts w:ascii="Calibri" w:hAnsi="Calibri"/>
+                <w:b/>
+                <w:sz w:val="18"/>
+              </w:rPr>
+              <w:t>1. Pitch &amp; hand-off</w:t>
+            </w:r>
+          </w:p>
+        </w:tc>
+        <w:tc>
+          <w:tcPr>
+            <w:tcW w:type="dxa" w:w="2533"/>
+          </w:tcPr>
+          <w:p>
+            <w:pPr>
+              <w:spacing w:after="40" w:before="40"/>
+            </w:pPr>
+            <w:r>
+              <w:rPr>
+                <w:rFonts w:ascii="Calibri" w:hAnsi="Calibri"/>
+                <w:b w:val="0"/>
+                <w:sz w:val="18"/>
+              </w:rPr>
+              <w:t>Walk hand-off to a hoop; foam OK; “give, don’t throw at the runner.”</w:t>
+            </w:r>
+          </w:p>
+        </w:tc>
+        <w:tc>
+          <w:tcPr>
+            <w:tcW w:type="dxa" w:w="2533"/>
+          </w:tcPr>
+          <w:p>
+            <w:pPr>
+              <w:spacing w:after="40" w:before="40"/>
+            </w:pPr>
+            <w:r>
+              <w:rPr>
+                <w:rFonts w:ascii="Calibri" w:hAnsi="Calibri"/>
+                <w:b w:val="0"/>
+                <w:sz w:val="18"/>
+              </w:rPr>
+              <w:t>Jog hand-off; runner jogs to a hoop or cone score; football at the hip in Dodge Lane.</w:t>
+            </w:r>
+          </w:p>
+        </w:tc>
+        <w:tc>
+          <w:tcPr>
+            <w:tcW w:type="dxa" w:w="2534"/>
+          </w:tcPr>
+          <w:p>
+            <w:pPr>
+              <w:spacing w:after="40" w:before="40"/>
+            </w:pPr>
+            <w:r>
+              <w:rPr>
+                <w:rFonts w:ascii="Calibri" w:hAnsi="Calibri"/>
+                <w:b w:val="0"/>
+                <w:sz w:val="18"/>
+              </w:rPr>
+              <w:t>Hand-off plus a soft flag pull on the runner after the hand-off — no shirt grabs; student callers OK.</w:t>
+            </w:r>
+          </w:p>
+        </w:tc>
+      </w:tr>
+      <w:tr>
+        <w:trPr>
+          <w:cantSplit/>
+        </w:trPr>
+        <w:tc>
+          <w:tcPr>
+            <w:tcW w:type="dxa" w:w="1400"/>
+          </w:tcPr>
+          <w:p>
+            <w:pPr>
+              <w:spacing w:after="40" w:before="40"/>
+            </w:pPr>
+            <w:r>
+              <w:rPr>
+                <w:rFonts w:ascii="Calibri" w:hAnsi="Calibri"/>
+                <w:b/>
+                <w:sz w:val="18"/>
+              </w:rPr>
+              <w:t>2. Defending the lane</w:t>
+            </w:r>
+          </w:p>
+        </w:tc>
+        <w:tc>
+          <w:tcPr>
+            <w:tcW w:type="dxa" w:w="2533"/>
+          </w:tcPr>
+          <w:p>
+            <w:pPr>
+              <w:spacing w:after="40" w:before="40"/>
+            </w:pPr>
+            <w:r>
+              <w:rPr>
+                <w:rFonts w:ascii="Calibri" w:hAnsi="Calibri"/>
+                <w:b w:val="0"/>
+                <w:sz w:val="18"/>
+              </w:rPr>
+              <w:t>Shadow only — defender stays between receiver and ball; no contact; soft underhand or short throw (foam OK).</w:t>
+            </w:r>
+          </w:p>
+        </w:tc>
+        <w:tc>
+          <w:tcPr>
+            <w:tcW w:type="dxa" w:w="2533"/>
+          </w:tcPr>
+          <w:p>
+            <w:pPr>
+              <w:spacing w:after="40" w:before="40"/>
+            </w:pPr>
+            <w:r>
+              <w:rPr>
+                <w:rFonts w:ascii="Calibri" w:hAnsi="Calibri"/>
+                <w:b w:val="0"/>
+                <w:sz w:val="18"/>
+              </w:rPr>
+              <w:t>Contest the catch — tip or soft intercept without contact; defender between receiver and ball.</w:t>
+            </w:r>
+          </w:p>
+        </w:tc>
+        <w:tc>
+          <w:tcPr>
+            <w:tcW w:type="dxa" w:w="2534"/>
+          </w:tcPr>
+          <w:p>
+            <w:pPr>
+              <w:spacing w:after="40" w:before="40"/>
+            </w:pPr>
+            <w:r>
+              <w:rPr>
+                <w:rFonts w:ascii="Calibri" w:hAnsi="Calibri"/>
+                <w:b w:val="0"/>
+                <w:sz w:val="18"/>
+              </w:rPr>
+              <w:t>Tip and catch — active intercept without contact; contest the ball, not the person; soft spiral stays soft.</w:t>
+            </w:r>
+          </w:p>
+        </w:tc>
+      </w:tr>
+      <w:tr>
+        <w:trPr>
+          <w:cantSplit/>
+        </w:trPr>
+        <w:tc>
+          <w:tcPr>
+            <w:tcW w:type="dxa" w:w="1400"/>
+          </w:tcPr>
+          <w:p>
+            <w:pPr>
+              <w:spacing w:after="40" w:before="40"/>
+            </w:pPr>
+            <w:r>
+              <w:rPr>
+                <w:rFonts w:ascii="Calibri" w:hAnsi="Calibri"/>
+                <w:b/>
+                <w:sz w:val="18"/>
+              </w:rPr>
+              <w:t>3. Small-sided flag play</w:t>
+            </w:r>
+          </w:p>
+        </w:tc>
+        <w:tc>
+          <w:tcPr>
+            <w:tcW w:type="dxa" w:w="2533"/>
+          </w:tcPr>
+          <w:p>
+            <w:pPr>
+              <w:spacing w:after="40" w:before="40"/>
+            </w:pPr>
+            <w:r>
+              <w:rPr>
+                <w:rFonts w:ascii="Calibri" w:hAnsi="Calibri"/>
+                <w:b w:val="0"/>
+                <w:sz w:val="18"/>
+              </w:rPr>
+              <w:t>3v3 to two end-zones, no rush; soft two-hand touch or gentle flag; five seconds to throw.</w:t>
+            </w:r>
+          </w:p>
+        </w:tc>
+        <w:tc>
+          <w:tcPr>
+            <w:tcW w:type="dxa" w:w="2533"/>
+          </w:tcPr>
+          <w:p>
+            <w:pPr>
+              <w:spacing w:after="40" w:before="40"/>
+            </w:pPr>
+            <w:r>
+              <w:rPr>
+                <w:rFonts w:ascii="Calibri" w:hAnsi="Calibri"/>
+                <w:b w:val="0"/>
+                <w:sz w:val="18"/>
+              </w:rPr>
+              <w:t>4v4 to two end-zones; soft flag or two-hand touch; five seconds to throw; everyone plays after a score.</w:t>
+            </w:r>
+          </w:p>
+        </w:tc>
+        <w:tc>
+          <w:tcPr>
+            <w:tcW w:type="dxa" w:w="2534"/>
+          </w:tcPr>
+          <w:p>
+            <w:pPr>
+              <w:spacing w:after="40" w:before="40"/>
+            </w:pPr>
+            <w:r>
+              <w:rPr>
+                <w:rFonts w:ascii="Calibri" w:hAnsi="Calibri"/>
+                <w:b w:val="0"/>
+                <w:sz w:val="18"/>
+              </w:rPr>
+              <w:t>5v5 to two end-zones; one rush after a count; soft flag or two-hand touch; five seconds to throw; student refs OK.</w:t>
+            </w:r>
+          </w:p>
+        </w:tc>
+      </w:tr>
+      <w:tr>
+        <w:trPr>
+          <w:cantSplit/>
+        </w:trPr>
+        <w:tc>
+          <w:tcPr>
+            <w:tcW w:type="dxa" w:w="1400"/>
+          </w:tcPr>
+          <w:p>
+            <w:pPr>
+              <w:spacing w:after="40" w:before="40"/>
+            </w:pPr>
+            <w:r>
+              <w:rPr>
+                <w:rFonts w:ascii="Calibri" w:hAnsi="Calibri"/>
+                <w:b/>
+                <w:sz w:val="18"/>
+              </w:rPr>
+              <w:t>4. Safe jail-catch &amp; teamwork</w:t>
+            </w:r>
+          </w:p>
+        </w:tc>
+        <w:tc>
+          <w:tcPr>
+            <w:tcW w:type="dxa" w:w="2533"/>
+          </w:tcPr>
+          <w:p>
+            <w:pPr>
+              <w:spacing w:after="40" w:before="40"/>
+            </w:pPr>
+            <w:r>
+              <w:rPr>
+                <w:rFonts w:ascii="Calibri" w:hAnsi="Calibri"/>
+                <w:b w:val="0"/>
+                <w:sz w:val="18"/>
+              </w:rPr>
+              <w:t>DODGEBALLS below the waist; teacher tosses to jail; walk pace; walk the sideline home.</w:t>
+            </w:r>
+          </w:p>
+        </w:tc>
+        <w:tc>
+          <w:tcPr>
+            <w:tcW w:type="dxa" w:w="2533"/>
+          </w:tcPr>
+          <w:p>
+            <w:pPr>
+              <w:spacing w:after="40" w:before="40"/>
+            </w:pPr>
+            <w:r>
+              <w:rPr>
+                <w:rFonts w:ascii="Calibri" w:hAnsi="Calibri"/>
+                <w:b w:val="0"/>
+                <w:sz w:val="18"/>
+              </w:rPr>
+              <w:t>DODGEBALLS below the waist; a teammate tosses to jail to free a player; walk the sideline home.</w:t>
+            </w:r>
+          </w:p>
+        </w:tc>
+        <w:tc>
+          <w:tcPr>
+            <w:tcW w:type="dxa" w:w="2534"/>
+          </w:tcPr>
+          <w:p>
+            <w:pPr>
+              <w:spacing w:after="40" w:before="40"/>
+            </w:pPr>
+            <w:r>
+              <w:rPr>
+                <w:rFonts w:ascii="Calibri" w:hAnsi="Calibri"/>
+                <w:b w:val="0"/>
+                <w:sz w:val="18"/>
+              </w:rPr>
+              <w:t>DODGEBALLS below the waist; two feet in jail to count; teammate toss frees; student refs; handshake line — one teammate cue.</w:t>
+            </w:r>
+          </w:p>
+        </w:tc>
+      </w:tr>
+    </w:tbl>
+    <w:p/>
+    <w:p>
+      <w:r>
+        <w:rPr>
+          <w:rFonts w:ascii="Calibri" w:hAnsi="Calibri"/>
+          <w:b/>
+          <w:sz w:val="22"/>
+        </w:rPr>
+        <w:t>Assessment suggestions</w:t>
+      </w:r>
+    </w:p>
+    <w:p>
+      <w:r>
+        <w:rPr>
+          <w:rFonts w:ascii="Calibri" w:hAnsi="Calibri"/>
+          <w:b/>
+          <w:sz w:val="22"/>
+        </w:rPr>
+        <w:t>Which lesson to observe which criterion</w:t>
+      </w:r>
+    </w:p>
+    <w:p>
+      <w:pPr>
+        <w:pStyle w:val="ListBullet"/>
+      </w:pPr>
+      <w:r>
+        <w:rPr>
+          <w:rFonts w:ascii="Calibri" w:hAnsi="Calibri"/>
+          <w:b w:val="0"/>
+          <w:sz w:val="22"/>
+        </w:rPr>
+        <w:t>Mon Oct 5: Criterion 1, pitch &amp; hand-off (skill station and Dodge Lane game).</w:t>
+      </w:r>
+    </w:p>
+    <w:p>
+      <w:pPr>
+        <w:pStyle w:val="ListBullet"/>
+      </w:pPr>
+      <w:r>
+        <w:rPr>
+          <w:rFonts w:ascii="Calibri" w:hAnsi="Calibri"/>
+          <w:b w:val="0"/>
+          <w:sz w:val="22"/>
+        </w:rPr>
+        <w:t>Tue Oct 6: Criterion 2, defending the lane (shadow / contest / tip-and-catch; Protect the King or Perfect Pass).</w:t>
+      </w:r>
+    </w:p>
+    <w:p>
+      <w:pPr>
+        <w:pStyle w:val="ListBullet"/>
+      </w:pPr>
+      <w:r>
+        <w:rPr>
+          <w:rFonts w:ascii="Calibri" w:hAnsi="Calibri"/>
+          <w:b w:val="0"/>
+          <w:sz w:val="22"/>
+        </w:rPr>
+        <w:t>Wed Oct 7 (early dismissal): Criterion 3, small-sided flag — watch during the game only; keep it tight and don’t add extra assessment.</w:t>
+      </w:r>
+    </w:p>
+    <w:p>
+      <w:pPr>
+        <w:pStyle w:val="ListBullet"/>
+      </w:pPr>
+      <w:r>
+        <w:rPr>
+          <w:rFonts w:ascii="Calibri" w:hAnsi="Calibri"/>
+          <w:b w:val="0"/>
+          <w:sz w:val="22"/>
+        </w:rPr>
+        <w:t>Thu Oct 8: Criterion 4, jail-catch (dodgeballs below the waist, bringing a teammate back, walking the sideline home).</w:t>
+      </w:r>
+    </w:p>
+    <w:p>
+      <w:pPr>
+        <w:pStyle w:val="ListBullet"/>
+      </w:pPr>
+      <w:r>
+        <w:rPr>
+          <w:rFonts w:ascii="Calibri" w:hAnsi="Calibri"/>
+          <w:b w:val="0"/>
+          <w:sz w:val="22"/>
+        </w:rPr>
+        <w:t>Fri Oct 9 (apply / choice): re-check any criterion you missed or want to confirm in the choice games (e.g., Protect the King with a football for defending; Perfect Pass or Football Frenzy for passing and fair play).</w:t>
+      </w:r>
+    </w:p>
+    <w:p>
+      <w:r>
+        <w:rPr>
+          <w:rFonts w:ascii="Calibri" w:hAnsi="Calibri"/>
+          <w:b/>
+          <w:sz w:val="22"/>
+        </w:rPr>
+        <w:t>Quick checklist (✓ = Proficient look-for seen; – = needs a reminder)</w:t>
+      </w:r>
+    </w:p>
+    <w:tbl>
+      <w:tblPr>
+        <w:tblStyle w:val="TableGrid"/>
+        <w:tblW w:type="auto" w:w="0"/>
+        <w:tblLayout w:type="fixed"/>
+        <w:tblLook w:firstColumn="1" w:firstRow="1" w:lastColumn="0" w:lastRow="0" w:noHBand="0" w:noVBand="1" w:val="04A0"/>
+        <w:tblLayout w:type="fixed"/>
+      </w:tblPr>
+      <w:tblGrid>
+        <w:gridCol w:w="1400"/>
+        <w:gridCol w:w="1900"/>
+        <w:gridCol w:w="1900"/>
+        <w:gridCol w:w="1900"/>
+        <w:gridCol w:w="1900"/>
+      </w:tblGrid>
+      <w:tr>
+        <w:trPr>
+          <w:tblHeader/>
+          <w:cantSplit/>
+        </w:trPr>
+        <w:tc>
+          <w:tcPr>
+            <w:tcW w:type="dxa" w:w="1400"/>
+            <w:shd w:val="clear" w:color="auto" w:fill="D9D9D9"/>
+          </w:tcPr>
+          <w:p>
+            <w:pPr>
+              <w:spacing w:after="40" w:before="40"/>
+            </w:pPr>
+            <w:r>
+              <w:rPr>
+                <w:rFonts w:ascii="Calibri" w:hAnsi="Calibri"/>
+                <w:b/>
+                <w:sz w:val="18"/>
+              </w:rPr>
+              <w:t>Student</w:t>
+            </w:r>
+          </w:p>
+        </w:tc>
+        <w:tc>
+          <w:tcPr>
+            <w:tcW w:type="dxa" w:w="1900"/>
+            <w:shd w:val="clear" w:color="auto" w:fill="D9D9D9"/>
+          </w:tcPr>
+          <w:p>
+            <w:pPr>
+              <w:spacing w:after="40" w:before="40"/>
+            </w:pPr>
+            <w:r>
+              <w:rPr>
+                <w:rFonts w:ascii="Calibri" w:hAnsi="Calibri"/>
+                <w:b/>
+                <w:sz w:val="18"/>
+              </w:rPr>
+              <w:t>1. Soft give, then go (Mon)</w:t>
+            </w:r>
+          </w:p>
+        </w:tc>
+        <w:tc>
+          <w:tcPr>
+            <w:tcW w:type="dxa" w:w="1900"/>
+            <w:shd w:val="clear" w:color="auto" w:fill="D9D9D9"/>
+          </w:tcPr>
+          <w:p>
+            <w:pPr>
+              <w:spacing w:after="40" w:before="40"/>
+            </w:pPr>
+            <w:r>
+              <w:rPr>
+                <w:rFonts w:ascii="Calibri" w:hAnsi="Calibri"/>
+                <w:b/>
+                <w:sz w:val="18"/>
+              </w:rPr>
+              <w:t>2. Between receiver &amp; ball, no contact (Tue)</w:t>
+            </w:r>
+          </w:p>
+        </w:tc>
+        <w:tc>
+          <w:tcPr>
+            <w:tcW w:type="dxa" w:w="1900"/>
+            <w:shd w:val="clear" w:color="auto" w:fill="D9D9D9"/>
+          </w:tcPr>
+          <w:p>
+            <w:pPr>
+              <w:spacing w:after="40" w:before="40"/>
+            </w:pPr>
+            <w:r>
+              <w:rPr>
+                <w:rFonts w:ascii="Calibri" w:hAnsi="Calibri"/>
+                <w:b/>
+                <w:sz w:val="18"/>
+              </w:rPr>
+              <w:t>3. Hike → pass → score, soft touch (Wed)</w:t>
+            </w:r>
+          </w:p>
+        </w:tc>
+        <w:tc>
+          <w:tcPr>
+            <w:tcW w:type="dxa" w:w="1900"/>
+            <w:shd w:val="clear" w:color="auto" w:fill="D9D9D9"/>
+          </w:tcPr>
+          <w:p>
+            <w:pPr>
+              <w:spacing w:after="40" w:before="40"/>
+            </w:pPr>
+            <w:r>
+              <w:rPr>
+                <w:rFonts w:ascii="Calibri" w:hAnsi="Calibri"/>
+                <w:b/>
+                <w:sz w:val="18"/>
+              </w:rPr>
+              <w:t>4. Dodgeballs below waist, bring teammate back (Thu)</w:t>
+            </w:r>
+          </w:p>
+        </w:tc>
+      </w:tr>
+      <w:tr>
+        <w:trPr>
+          <w:cantSplit/>
+        </w:trPr>
+        <w:tc>
+          <w:tcPr>
+            <w:tcW w:type="dxa" w:w="1400"/>
+          </w:tcPr>
+          <w:p>
+            <w:pPr>
+              <w:spacing w:after="40" w:before="40"/>
+            </w:pPr>
+            <w:r>
+              <w:rPr>
+                <w:rFonts w:ascii="Calibri" w:hAnsi="Calibri"/>
+                <w:b w:val="0"/>
+                <w:sz w:val="18"/>
+              </w:rPr>
+            </w:r>
+          </w:p>
+        </w:tc>
+        <w:tc>
+          <w:tcPr>
+            <w:tcW w:type="dxa" w:w="1900"/>
+          </w:tcPr>
+          <w:p>
+            <w:pPr>
+              <w:spacing w:after="40" w:before="40"/>
+            </w:pPr>
+            <w:r>
+              <w:rPr>
+                <w:rFonts w:ascii="Calibri" w:hAnsi="Calibri"/>
+                <w:b w:val="0"/>
+                <w:sz w:val="18"/>
+              </w:rPr>
+            </w:r>
+          </w:p>
+        </w:tc>
+        <w:tc>
+          <w:tcPr>
+            <w:tcW w:type="dxa" w:w="1900"/>
+          </w:tcPr>
+          <w:p>
+            <w:pPr>
+              <w:spacing w:after="40" w:before="40"/>
+            </w:pPr>
+            <w:r>
+              <w:rPr>
+                <w:rFonts w:ascii="Calibri" w:hAnsi="Calibri"/>
+                <w:b w:val="0"/>
+                <w:sz w:val="18"/>
+              </w:rPr>
+            </w:r>
+          </w:p>
+        </w:tc>
+        <w:tc>
+          <w:tcPr>
+            <w:tcW w:type="dxa" w:w="1900"/>
+          </w:tcPr>
+          <w:p>
+            <w:pPr>
+              <w:spacing w:after="40" w:before="40"/>
+            </w:pPr>
+            <w:r>
+              <w:rPr>
+                <w:rFonts w:ascii="Calibri" w:hAnsi="Calibri"/>
+                <w:b w:val="0"/>
+                <w:sz w:val="18"/>
+              </w:rPr>
+            </w:r>
+          </w:p>
+        </w:tc>
+        <w:tc>
+          <w:tcPr>
+            <w:tcW w:type="dxa" w:w="1900"/>
+          </w:tcPr>
+          <w:p>
+            <w:pPr>
+              <w:spacing w:after="40" w:before="40"/>
+            </w:pPr>
+            <w:r>
+              <w:rPr>
+                <w:rFonts w:ascii="Calibri" w:hAnsi="Calibri"/>
+                <w:b w:val="0"/>
+                <w:sz w:val="18"/>
+              </w:rPr>
+            </w:r>
+          </w:p>
+        </w:tc>
+      </w:tr>
+      <w:tr>
+        <w:trPr>
+          <w:cantSplit/>
+        </w:trPr>
+        <w:tc>
+          <w:tcPr>
+            <w:tcW w:type="dxa" w:w="1400"/>
+          </w:tcPr>
+          <w:p>
+            <w:pPr>
+              <w:spacing w:after="40" w:before="40"/>
+            </w:pPr>
+            <w:r>
+              <w:rPr>
+                <w:rFonts w:ascii="Calibri" w:hAnsi="Calibri"/>
+                <w:b w:val="0"/>
+                <w:sz w:val="18"/>
+              </w:rPr>
+            </w:r>
+          </w:p>
+        </w:tc>
+        <w:tc>
+          <w:tcPr>
+            <w:tcW w:type="dxa" w:w="1900"/>
+          </w:tcPr>
+          <w:p>
+            <w:pPr>
+              <w:spacing w:after="40" w:before="40"/>
+            </w:pPr>
+            <w:r>
+              <w:rPr>
+                <w:rFonts w:ascii="Calibri" w:hAnsi="Calibri"/>
+                <w:b w:val="0"/>
+                <w:sz w:val="18"/>
+              </w:rPr>
+            </w:r>
+          </w:p>
+        </w:tc>
+        <w:tc>
+          <w:tcPr>
+            <w:tcW w:type="dxa" w:w="1900"/>
+          </w:tcPr>
+          <w:p>
+            <w:pPr>
+              <w:spacing w:after="40" w:before="40"/>
+            </w:pPr>
+            <w:r>
+              <w:rPr>
+                <w:rFonts w:ascii="Calibri" w:hAnsi="Calibri"/>
+                <w:b w:val="0"/>
+                <w:sz w:val="18"/>
+              </w:rPr>
+            </w:r>
+          </w:p>
+        </w:tc>
+        <w:tc>
+          <w:tcPr>
+            <w:tcW w:type="dxa" w:w="1900"/>
+          </w:tcPr>
+          <w:p>
+            <w:pPr>
+              <w:spacing w:after="40" w:before="40"/>
+            </w:pPr>
+            <w:r>
+              <w:rPr>
+                <w:rFonts w:ascii="Calibri" w:hAnsi="Calibri"/>
+                <w:b w:val="0"/>
+                <w:sz w:val="18"/>
+              </w:rPr>
+            </w:r>
+          </w:p>
+        </w:tc>
+        <w:tc>
+          <w:tcPr>
+            <w:tcW w:type="dxa" w:w="1900"/>
+          </w:tcPr>
+          <w:p>
+            <w:pPr>
+              <w:spacing w:after="40" w:before="40"/>
+            </w:pPr>
+            <w:r>
+              <w:rPr>
+                <w:rFonts w:ascii="Calibri" w:hAnsi="Calibri"/>
+                <w:b w:val="0"/>
+                <w:sz w:val="18"/>
+              </w:rPr>
+            </w:r>
+          </w:p>
+        </w:tc>
+      </w:tr>
+      <w:tr>
+        <w:trPr>
+          <w:cantSplit/>
+        </w:trPr>
+        <w:tc>
+          <w:tcPr>
+            <w:tcW w:type="dxa" w:w="1400"/>
+          </w:tcPr>
+          <w:p>
+            <w:pPr>
+              <w:spacing w:after="40" w:before="40"/>
+            </w:pPr>
+            <w:r>
+              <w:rPr>
+                <w:rFonts w:ascii="Calibri" w:hAnsi="Calibri"/>
+                <w:b w:val="0"/>
+                <w:sz w:val="18"/>
+              </w:rPr>
+            </w:r>
+          </w:p>
+        </w:tc>
+        <w:tc>
+          <w:tcPr>
+            <w:tcW w:type="dxa" w:w="1900"/>
+          </w:tcPr>
+          <w:p>
+            <w:pPr>
+              <w:spacing w:after="40" w:before="40"/>
+            </w:pPr>
+            <w:r>
+              <w:rPr>
+                <w:rFonts w:ascii="Calibri" w:hAnsi="Calibri"/>
+                <w:b w:val="0"/>
+                <w:sz w:val="18"/>
+              </w:rPr>
+            </w:r>
+          </w:p>
+        </w:tc>
+        <w:tc>
+          <w:tcPr>
+            <w:tcW w:type="dxa" w:w="1900"/>
+          </w:tcPr>
+          <w:p>
+            <w:pPr>
+              <w:spacing w:after="40" w:before="40"/>
+            </w:pPr>
+            <w:r>
+              <w:rPr>
+                <w:rFonts w:ascii="Calibri" w:hAnsi="Calibri"/>
+                <w:b w:val="0"/>
+                <w:sz w:val="18"/>
+              </w:rPr>
+            </w:r>
+          </w:p>
+        </w:tc>
+        <w:tc>
+          <w:tcPr>
+            <w:tcW w:type="dxa" w:w="1900"/>
+          </w:tcPr>
+          <w:p>
+            <w:pPr>
+              <w:spacing w:after="40" w:before="40"/>
+            </w:pPr>
+            <w:r>
+              <w:rPr>
+                <w:rFonts w:ascii="Calibri" w:hAnsi="Calibri"/>
+                <w:b w:val="0"/>
+                <w:sz w:val="18"/>
+              </w:rPr>
+            </w:r>
+          </w:p>
+        </w:tc>
+        <w:tc>
+          <w:tcPr>
+            <w:tcW w:type="dxa" w:w="1900"/>
+          </w:tcPr>
+          <w:p>
+            <w:pPr>
+              <w:spacing w:after="40" w:before="40"/>
+            </w:pPr>
+            <w:r>
+              <w:rPr>
+                <w:rFonts w:ascii="Calibri" w:hAnsi="Calibri"/>
+                <w:b w:val="0"/>
+                <w:sz w:val="18"/>
+              </w:rPr>
+            </w:r>
+          </w:p>
+        </w:tc>
+      </w:tr>
+      <w:tr>
+        <w:trPr>
+          <w:cantSplit/>
+        </w:trPr>
+        <w:tc>
+          <w:tcPr>
+            <w:tcW w:type="dxa" w:w="1400"/>
+          </w:tcPr>
+          <w:p>
+            <w:pPr>
+              <w:spacing w:after="40" w:before="40"/>
+            </w:pPr>
+            <w:r>
+              <w:rPr>
+                <w:rFonts w:ascii="Calibri" w:hAnsi="Calibri"/>
+                <w:b w:val="0"/>
+                <w:sz w:val="18"/>
+              </w:rPr>
+            </w:r>
+          </w:p>
+        </w:tc>
+        <w:tc>
+          <w:tcPr>
+            <w:tcW w:type="dxa" w:w="1900"/>
+          </w:tcPr>
+          <w:p>
+            <w:pPr>
+              <w:spacing w:after="40" w:before="40"/>
+            </w:pPr>
+            <w:r>
+              <w:rPr>
+                <w:rFonts w:ascii="Calibri" w:hAnsi="Calibri"/>
+                <w:b w:val="0"/>
+                <w:sz w:val="18"/>
+              </w:rPr>
+            </w:r>
+          </w:p>
+        </w:tc>
+        <w:tc>
+          <w:tcPr>
+            <w:tcW w:type="dxa" w:w="1900"/>
+          </w:tcPr>
+          <w:p>
+            <w:pPr>
+              <w:spacing w:after="40" w:before="40"/>
+            </w:pPr>
+            <w:r>
+              <w:rPr>
+                <w:rFonts w:ascii="Calibri" w:hAnsi="Calibri"/>
+                <w:b w:val="0"/>
+                <w:sz w:val="18"/>
+              </w:rPr>
+            </w:r>
+          </w:p>
+        </w:tc>
+        <w:tc>
+          <w:tcPr>
+            <w:tcW w:type="dxa" w:w="1900"/>
+          </w:tcPr>
+          <w:p>
+            <w:pPr>
+              <w:spacing w:after="40" w:before="40"/>
+            </w:pPr>
+            <w:r>
+              <w:rPr>
+                <w:rFonts w:ascii="Calibri" w:hAnsi="Calibri"/>
+                <w:b w:val="0"/>
+                <w:sz w:val="18"/>
+              </w:rPr>
+            </w:r>
+          </w:p>
+        </w:tc>
+        <w:tc>
+          <w:tcPr>
+            <w:tcW w:type="dxa" w:w="1900"/>
+          </w:tcPr>
+          <w:p>
+            <w:pPr>
+              <w:spacing w:after="40" w:before="40"/>
+            </w:pPr>
+            <w:r>
+              <w:rPr>
+                <w:rFonts w:ascii="Calibri" w:hAnsi="Calibri"/>
+                <w:b w:val="0"/>
+                <w:sz w:val="18"/>
+              </w:rPr>
+            </w:r>
+          </w:p>
+        </w:tc>
+      </w:tr>
+      <w:tr>
+        <w:trPr>
+          <w:cantSplit/>
+        </w:trPr>
+        <w:tc>
+          <w:tcPr>
+            <w:tcW w:type="dxa" w:w="1400"/>
+          </w:tcPr>
+          <w:p>
+            <w:pPr>
+              <w:spacing w:after="40" w:before="40"/>
+            </w:pPr>
+            <w:r>
+              <w:rPr>
+                <w:rFonts w:ascii="Calibri" w:hAnsi="Calibri"/>
+                <w:b w:val="0"/>
+                <w:sz w:val="18"/>
+              </w:rPr>
+            </w:r>
+          </w:p>
+        </w:tc>
+        <w:tc>
+          <w:tcPr>
+            <w:tcW w:type="dxa" w:w="1900"/>
+          </w:tcPr>
+          <w:p>
+            <w:pPr>
+              <w:spacing w:after="40" w:before="40"/>
+            </w:pPr>
+            <w:r>
+              <w:rPr>
+                <w:rFonts w:ascii="Calibri" w:hAnsi="Calibri"/>
+                <w:b w:val="0"/>
+                <w:sz w:val="18"/>
+              </w:rPr>
+            </w:r>
+          </w:p>
+        </w:tc>
+        <w:tc>
+          <w:tcPr>
+            <w:tcW w:type="dxa" w:w="1900"/>
+          </w:tcPr>
+          <w:p>
+            <w:pPr>
+              <w:spacing w:after="40" w:before="40"/>
+            </w:pPr>
+            <w:r>
+              <w:rPr>
+                <w:rFonts w:ascii="Calibri" w:hAnsi="Calibri"/>
+                <w:b w:val="0"/>
+                <w:sz w:val="18"/>
+              </w:rPr>
+            </w:r>
+          </w:p>
+        </w:tc>
+        <w:tc>
+          <w:tcPr>
+            <w:tcW w:type="dxa" w:w="1900"/>
+          </w:tcPr>
+          <w:p>
+            <w:pPr>
+              <w:spacing w:after="40" w:before="40"/>
+            </w:pPr>
+            <w:r>
+              <w:rPr>
+                <w:rFonts w:ascii="Calibri" w:hAnsi="Calibri"/>
+                <w:b w:val="0"/>
+                <w:sz w:val="18"/>
+              </w:rPr>
+            </w:r>
+          </w:p>
+        </w:tc>
+        <w:tc>
+          <w:tcPr>
+            <w:tcW w:type="dxa" w:w="1900"/>
+          </w:tcPr>
+          <w:p>
+            <w:pPr>
+              <w:spacing w:after="40" w:before="40"/>
+            </w:pPr>
+            <w:r>
+              <w:rPr>
+                <w:rFonts w:ascii="Calibri" w:hAnsi="Calibri"/>
+                <w:b w:val="0"/>
+                <w:sz w:val="18"/>
+              </w:rPr>
+            </w:r>
+          </w:p>
+        </w:tc>
+      </w:tr>
+      <w:tr>
+        <w:trPr>
+          <w:cantSplit/>
+        </w:trPr>
+        <w:tc>
+          <w:tcPr>
+            <w:tcW w:type="dxa" w:w="1400"/>
+          </w:tcPr>
+          <w:p>
+            <w:pPr>
+              <w:spacing w:after="40" w:before="40"/>
+            </w:pPr>
+            <w:r>
+              <w:rPr>
+                <w:rFonts w:ascii="Calibri" w:hAnsi="Calibri"/>
+                <w:b w:val="0"/>
+                <w:sz w:val="18"/>
+              </w:rPr>
+            </w:r>
+          </w:p>
+        </w:tc>
+        <w:tc>
+          <w:tcPr>
+            <w:tcW w:type="dxa" w:w="1900"/>
+          </w:tcPr>
+          <w:p>
+            <w:pPr>
+              <w:spacing w:after="40" w:before="40"/>
+            </w:pPr>
+            <w:r>
+              <w:rPr>
+                <w:rFonts w:ascii="Calibri" w:hAnsi="Calibri"/>
+                <w:b w:val="0"/>
+                <w:sz w:val="18"/>
+              </w:rPr>
+            </w:r>
+          </w:p>
+        </w:tc>
+        <w:tc>
+          <w:tcPr>
+            <w:tcW w:type="dxa" w:w="1900"/>
+          </w:tcPr>
+          <w:p>
+            <w:pPr>
+              <w:spacing w:after="40" w:before="40"/>
+            </w:pPr>
+            <w:r>
+              <w:rPr>
+                <w:rFonts w:ascii="Calibri" w:hAnsi="Calibri"/>
+                <w:b w:val="0"/>
+                <w:sz w:val="18"/>
+              </w:rPr>
+            </w:r>
+          </w:p>
+        </w:tc>
+        <w:tc>
+          <w:tcPr>
+            <w:tcW w:type="dxa" w:w="1900"/>
+          </w:tcPr>
+          <w:p>
+            <w:pPr>
+              <w:spacing w:after="40" w:before="40"/>
+            </w:pPr>
+            <w:r>
+              <w:rPr>
+                <w:rFonts w:ascii="Calibri" w:hAnsi="Calibri"/>
+                <w:b w:val="0"/>
+                <w:sz w:val="18"/>
+              </w:rPr>
+            </w:r>
+          </w:p>
+        </w:tc>
+        <w:tc>
+          <w:tcPr>
+            <w:tcW w:type="dxa" w:w="1900"/>
+          </w:tcPr>
+          <w:p>
+            <w:pPr>
+              <w:spacing w:after="40" w:before="40"/>
+            </w:pPr>
+            <w:r>
+              <w:rPr>
+                <w:rFonts w:ascii="Calibri" w:hAnsi="Calibri"/>
+                <w:b w:val="0"/>
+                <w:sz w:val="18"/>
+              </w:rPr>
+            </w:r>
+          </w:p>
+        </w:tc>
+      </w:tr>
+    </w:tbl>
+    <w:p/>
+    <w:p>
+      <w:r>
+        <w:rPr>
+          <w:rFonts w:ascii="Calibri" w:hAnsi="Calibri"/>
+          <w:b/>
+          <w:sz w:val="22"/>
+        </w:rPr>
+        <w:t>Exit-ticket questions (use the cool-down moment; answers can be spoken, thumbs, or on a slip)</w:t>
+      </w:r>
+    </w:p>
+    <w:p>
+      <w:pPr>
+        <w:pStyle w:val="ListBullet"/>
+      </w:pPr>
+      <w:r>
+        <w:rPr>
+          <w:rFonts w:ascii="Calibri" w:hAnsi="Calibri"/>
+          <w:b w:val="0"/>
+          <w:sz w:val="22"/>
+        </w:rPr>
+        <w:t>Mon: What is the safe way to hand off the ball? (Give, don’t throw at the runner.)</w:t>
+      </w:r>
+    </w:p>
+    <w:p>
+      <w:pPr>
+        <w:pStyle w:val="ListBullet"/>
+      </w:pPr>
+      <w:r>
+        <w:rPr>
+          <w:rFonts w:ascii="Calibri" w:hAnsi="Calibri"/>
+          <w:b w:val="0"/>
+          <w:sz w:val="22"/>
+        </w:rPr>
+        <w:t>Tue: When you defend the lane, what do you contest — the ball or the person? (The ball, not the person.)</w:t>
+      </w:r>
+    </w:p>
+    <w:p>
+      <w:pPr>
+        <w:pStyle w:val="ListBullet"/>
+      </w:pPr>
+      <w:r>
+        <w:rPr>
+          <w:rFonts w:ascii="Calibri" w:hAnsi="Calibri"/>
+          <w:b w:val="0"/>
+          <w:sz w:val="22"/>
+        </w:rPr>
+        <w:t>Thu: Which balls do we use for jail-catch, and where do we throw? (Dodgeballs, below the waist — not footballs.)</w:t>
+      </w:r>
+    </w:p>
+    <w:p>
+      <w:pPr>
+        <w:pStyle w:val="ListBullet"/>
+      </w:pPr>
+      <w:r>
+        <w:rPr>
+          <w:rFonts w:ascii="Calibri" w:hAnsi="Calibri"/>
+          <w:b w:val="0"/>
+          <w:sz w:val="22"/>
+        </w:rPr>
+        <w:t>Fri: Name one kind tag or soft catch from the week. (Gr 5–6: name one teammate cue that helped this week.)</w:t>
+      </w:r>
+    </w:p>
+    <w:p>
+      <w:pPr>
+        <w:pStyle w:val="Heading2"/>
+      </w:pPr>
+      <w:r>
         <w:t>If the gym is short</w:t>
       </w:r>
     </w:p>

</xml_diff>